<commit_message>
Add user-provided Hebrew sources to both seminars
- Self-efficacy: replace the Hebrew reference with Schunk, D. H. (2001),
  "מסוגלות עצמית ומוטיבציה לימודית" (Hebrew translation in חינוך החשיבה 20;
  original Educational Psychologist, 1991), cited in the intro.
- Hope: add Levi, O. (2020), "תפקידה של תופעת התקווה בטראומה מורכבת
  ובדיסוציאציה" (פסיכולוגיה עברית) as a second Hebrew source, cited in the intro.

Co-Authored-By: Claude Opus 4.8 <noreply@anthropic.com>
Claude-Session: https://claude.ai/code/session_01YH1N5dULXnq2hJCrBuBusq
</commit_message>
<xml_diff>
--- a/examples/seminar-psychology-hope.docx
+++ b/examples/seminar-psychology-hope.docx
@@ -372,7 +372,7 @@
           <w:szCs w:val="24"/>
           <w:rtl/>
         </w:rPr>
-        <w:t xml:space="preserve">תקווה נשמעת כמו מילה יומיומית, אבל בפסיכולוגיה יש לה הגדרה מדויקת. סניידר (Snyder, 2002) תיאר תקווה כדרך חשיבה על מטרות, ולא כרגש בלבד. לפי המודל שלו יש לתקווה שני רכיבים. הראשון הוא חשיבה מוכוונת-מטרה (agency), האמונה של האדם ביכולתו להניע את עצמו לעבר המטרה ולהחזיק במוטיבציה לאורך הדרך. השני הוא חשיבה מוכוונת-תהליך (pathways), היכולת לייצר מסלולים מעשיים אל המטרה ולמצוא מסלול חלופי כשהדרך הראשונה נחסמת. אדם בעל תקווה גבוהה מחזיק בשניהם, גם ברצון וגם בדרכים. בעברית הרחיב עמית (2024) את הרעיון והציע מודל תקווה יישומי, שמוסיף לתיאוריה הקוגניטיבית של סניידר גם ממד רגשי וממד התנהגותי.</w:t>
+        <w:t xml:space="preserve">תקווה נשמעת כמו מילה יומיומית, אבל בפסיכולוגיה יש לה הגדרה מדויקת. סניידר (Snyder, 2002) תיאר תקווה כדרך חשיבה על מטרות, ולא כרגש בלבד. לפי המודל שלו יש לתקווה שני רכיבים. הראשון הוא חשיבה מוכוונת-מטרה (agency), האמונה של האדם ביכולתו להניע את עצמו לעבר המטרה ולהחזיק במוטיבציה לאורך הדרך. השני הוא חשיבה מוכוונת-תהליך (pathways), היכולת לייצר מסלולים מעשיים אל המטרה ולמצוא מסלול חלופי כשהדרך הראשונה נחסמת. אדם בעל תקווה גבוהה מחזיק בשניהם, גם ברצון וגם בדרכים. בעברית הרחיב עמית (2024) את הרעיון והציע מודל תקווה יישומי, שמוסיף לתיאוריה הקוגניטיבית של סניידר גם ממד רגשי וממד התנהגותי. לוי (2020) מתאר את תופעת התקווה כבעלת פן מודע, של הצבת מטרות והשגתן, ופן לא מודע, של חתירה מתמדת לסיפוק צרכים נפשיים, ורואה בה משאב משמעותי בהתמודדות עם קשיים.</w:t>
       </w:r>
     </w:p>
     <w:p>
@@ -4317,6 +4317,28 @@
           <w:rtl/>
         </w:rPr>
         <w:t xml:space="preserve">רשימת מקורות</w:t>
+      </w:r>
+    </w:p>
+    <w:p>
+      <w:pPr>
+        <w:bidi/>
+        <w:spacing w:after="140" w:line="360"/>
+        <w:ind w:start="720" w:hanging="720"/>
+        <w:jc w:val="right"/>
+      </w:pPr>
+      <w:r>
+        <w:rPr>
+          <w:rFonts w:ascii="David" w:cs="David" w:eastAsia="David" w:hAnsi="David"/>
+          <w:b w:val="false"/>
+          <w:bCs w:val="false"/>
+          <w:i w:val="false"/>
+          <w:iCs w:val="false"/>
+          <w:color w:val="000000"/>
+          <w:sz w:val="24"/>
+          <w:szCs w:val="24"/>
+          <w:rtl/>
+        </w:rPr>
+        <w:t xml:space="preserve">לוי, א' (2020). תפקידה של תופעת התקווה בטראומה מורכבת ובדיסוציאציה. פסיכולוגיה עברית. https://www.hebpsy.net/articles.asp?id=4076</w:t>
       </w:r>
     </w:p>
     <w:p>

</xml_diff>